<commit_message>
fix: preserve sync intent through failed startup and local storage writes
</commit_message>
<xml_diff>
--- a/docs/JackYun-4.0.0-Multidevice-Sync-20261011.docx
+++ b/docs/JackYun-4.0.0-Multidevice-Sync-20261011.docx
@@ -939,7 +939,7 @@
               <w:rPr>
                 <w:sz w:val="20"/>
               </w:rPr>
-              <w:t>106 项通过，含真实引擎的两设备并发、冲突重启、丢包幂等、新编辑新 ID、删除冲突、备份失败保护等。</w:t>
+              <w:t>109 项通过，含真实引擎的两设备并发、冲突重启、丢包幂等、新编辑新 ID、删除冲突、备份失败保护等。</w:t>
             </w:r>
           </w:p>
         </w:tc>
@@ -1041,7 +1041,7 @@
               <w:rPr>
                 <w:sz w:val="20"/>
               </w:rPr>
-              <w:t>16 项单元/HTTP 边界测试通过；真实 Azure 事务验证版本、哈希、历史、租户隔离。</w:t>
+              <w:t>16 项单元/HTTP 边界测试及两项学习动作并发测试通过；真实 Azure 事务验证版本、哈希、历史、租户隔离。</w:t>
             </w:r>
           </w:p>
         </w:tc>

</xml_diff>

<commit_message>
fix: preserve merged UI state and serialize local save intents
</commit_message>
<xml_diff>
--- a/docs/JackYun-4.0.0-Multidevice-Sync-20261011.docx
+++ b/docs/JackYun-4.0.0-Multidevice-Sync-20261011.docx
@@ -939,7 +939,7 @@
               <w:rPr>
                 <w:sz w:val="20"/>
               </w:rPr>
-              <w:t>109 项通过，含真实引擎的两设备并发、冲突重启、丢包幂等、新编辑新 ID、删除冲突、备份失败保护等。</w:t>
+              <w:t>111 项通过，含真实引擎的两设备并发、冲突重启、丢包幂等、新编辑新 ID、删除冲突、备份失败保护等。</w:t>
             </w:r>
           </w:p>
         </w:tc>
@@ -1007,7 +1007,7 @@
               <w:rPr>
                 <w:sz w:val="20"/>
               </w:rPr>
-              <w:t>学习 180 项、雅思写作 22 项、认证与恢复等专项通过；均为自动化回归。</w:t>
+              <w:t>学习 180 项、雅思写作 24 项、认证与恢复等专项通过；均为自动化回归。</w:t>
             </w:r>
           </w:p>
         </w:tc>

</xml_diff>

<commit_message>
fix(sync): preserve insertion anchors and guard subject color
</commit_message>
<xml_diff>
--- a/docs/JackYun-4.0.0-Multidevice-Sync-20261011.docx
+++ b/docs/JackYun-4.0.0-Multidevice-Sync-20261011.docx
@@ -64,9 +64,7 @@
       </w:r>
     </w:p>
     <w:p>
-      <w:r>
-        <w:br w:type="page"/>
-      </w:r>
+      <w:r/>
     </w:p>
     <w:p>
       <w:pPr>
@@ -380,9 +378,7 @@
       </w:r>
     </w:p>
     <w:p>
-      <w:r>
-        <w:br w:type="page"/>
-      </w:r>
+      <w:r/>
     </w:p>
     <w:p>
       <w:pPr>
@@ -447,9 +443,7 @@
       </w:r>
     </w:p>
     <w:p>
-      <w:r>
-        <w:br w:type="page"/>
-      </w:r>
+      <w:r/>
     </w:p>
     <w:p>
       <w:pPr>
@@ -852,9 +846,7 @@
       </w:r>
     </w:p>
     <w:p>
-      <w:r>
-        <w:br w:type="page"/>
-      </w:r>
+      <w:r/>
     </w:p>
     <w:p>
       <w:pPr>
@@ -939,7 +931,7 @@
               <w:rPr>
                 <w:sz w:val="20"/>
               </w:rPr>
-              <w:t>111 项通过，含真实引擎的两设备并发、冲突重启、丢包幂等、新编辑新 ID、删除冲突、备份失败保护等。</w:t>
+              <w:t>112 项通过，含真实引擎的两设备并发、冲突重启、丢包幂等、新编辑新 ID、删除冲突、备份失败保护等。</w:t>
             </w:r>
           </w:p>
         </w:tc>
@@ -1041,7 +1033,7 @@
               <w:rPr>
                 <w:sz w:val="20"/>
               </w:rPr>
-              <w:t>16 项单元/HTTP 边界测试及两项学习动作并发测试通过；真实 Azure 事务验证版本、哈希、历史、租户隔离。</w:t>
+              <w:t>16 项单元/HTTP 边界测试及三项学习动作并发测试通过；真实 Azure 事务验证版本、哈希、历史、租户隔离。</w:t>
             </w:r>
           </w:p>
         </w:tc>
@@ -1139,9 +1131,7 @@
       </w:r>
     </w:p>
     <w:p>
-      <w:r>
-        <w:br w:type="page"/>
-      </w:r>
+      <w:r/>
     </w:p>
     <w:p>
       <w:pPr>

</xml_diff>